<commit_message>
Add week3 materials and updates
</commit_message>
<xml_diff>
--- a/individual_project/GGS662_individual_project_26_08_24.docx
+++ b/individual_project/GGS662_individual_project_26_08_24.docx
@@ -93,6 +93,7 @@
         </w:rPr>
         <w:t xml:space="preserve">Agentic </w:t>
       </w:r>
+      <w:proofErr w:type="spellStart"/>
       <w:r>
         <w:rPr>
           <w:rFonts w:ascii="Times New Roman" w:hAnsi="Times New Roman" w:cs="Times New Roman"/>
@@ -102,6 +103,7 @@
         </w:rPr>
         <w:t>GeoAI</w:t>
       </w:r>
+      <w:proofErr w:type="spellEnd"/>
     </w:p>
     <w:p>
       <w:pPr>
@@ -247,11 +249,19 @@
         </w:rPr>
         <w:t xml:space="preserve">Agentic </w:t>
       </w:r>
-      <w:r>
-        <w:rPr>
-          <w:rFonts w:ascii="Times New Roman" w:hAnsi="Times New Roman" w:cs="Times New Roman"/>
-        </w:rPr>
-        <w:t xml:space="preserve">GeoAI </w:t>
+      <w:proofErr w:type="spellStart"/>
+      <w:r>
+        <w:rPr>
+          <w:rFonts w:ascii="Times New Roman" w:hAnsi="Times New Roman" w:cs="Times New Roman"/>
+        </w:rPr>
+        <w:t>GeoAI</w:t>
+      </w:r>
+      <w:proofErr w:type="spellEnd"/>
+      <w:r>
+        <w:rPr>
+          <w:rFonts w:ascii="Times New Roman" w:hAnsi="Times New Roman" w:cs="Times New Roman"/>
+        </w:rPr>
+        <w:t xml:space="preserve"> </w:t>
       </w:r>
       <w:r>
         <w:rPr>
@@ -299,8 +309,16 @@
         <w:rPr>
           <w:rFonts w:ascii="Times New Roman" w:hAnsi="Times New Roman" w:cs="Times New Roman"/>
         </w:rPr>
-        <w:t>Agentic GeoAI</w:t>
-      </w:r>
+        <w:t xml:space="preserve">Agentic </w:t>
+      </w:r>
+      <w:proofErr w:type="spellStart"/>
+      <w:r>
+        <w:rPr>
+          <w:rFonts w:ascii="Times New Roman" w:hAnsi="Times New Roman" w:cs="Times New Roman"/>
+        </w:rPr>
+        <w:t>GeoAI</w:t>
+      </w:r>
+      <w:proofErr w:type="spellEnd"/>
       <w:r>
         <w:rPr>
           <w:rFonts w:ascii="Times New Roman" w:hAnsi="Times New Roman" w:cs="Times New Roman"/>
@@ -349,8 +367,16 @@
         <w:rPr>
           <w:rFonts w:ascii="Times New Roman" w:hAnsi="Times New Roman" w:cs="Times New Roman"/>
         </w:rPr>
-        <w:t>Agentic GeoAI</w:t>
-      </w:r>
+        <w:t xml:space="preserve">Agentic </w:t>
+      </w:r>
+      <w:proofErr w:type="spellStart"/>
+      <w:r>
+        <w:rPr>
+          <w:rFonts w:ascii="Times New Roman" w:hAnsi="Times New Roman" w:cs="Times New Roman"/>
+        </w:rPr>
+        <w:t>GeoAI</w:t>
+      </w:r>
+      <w:proofErr w:type="spellEnd"/>
       <w:r>
         <w:rPr>
           <w:rFonts w:ascii="Times New Roman" w:hAnsi="Times New Roman" w:cs="Times New Roman"/>
@@ -527,7 +553,63 @@
         <w:rPr>
           <w:rFonts w:ascii="Times New Roman" w:hAnsi="Times New Roman" w:cs="Times New Roman"/>
         </w:rPr>
-        <w:t>Deploy autonomous AI agents for research purposes, such as to design, build, execute and iteratively improve geospatial models and simulation</w:t>
+        <w:t xml:space="preserve">Deploy autonomous AI agents for research purposes, such as </w:t>
+      </w:r>
+      <w:proofErr w:type="gramStart"/>
+      <w:r>
+        <w:rPr>
+          <w:rFonts w:ascii="Times New Roman" w:hAnsi="Times New Roman" w:cs="Times New Roman"/>
+        </w:rPr>
+        <w:t>to design</w:t>
+      </w:r>
+      <w:proofErr w:type="gramEnd"/>
+      <w:r>
+        <w:rPr>
+          <w:rFonts w:ascii="Times New Roman" w:hAnsi="Times New Roman" w:cs="Times New Roman"/>
+        </w:rPr>
+        <w:t xml:space="preserve">, </w:t>
+      </w:r>
+      <w:proofErr w:type="gramStart"/>
+      <w:r>
+        <w:rPr>
+          <w:rFonts w:ascii="Times New Roman" w:hAnsi="Times New Roman" w:cs="Times New Roman"/>
+        </w:rPr>
+        <w:t>build</w:t>
+      </w:r>
+      <w:proofErr w:type="gramEnd"/>
+      <w:r>
+        <w:rPr>
+          <w:rFonts w:ascii="Times New Roman" w:hAnsi="Times New Roman" w:cs="Times New Roman"/>
+        </w:rPr>
+        <w:t xml:space="preserve">, </w:t>
+      </w:r>
+      <w:proofErr w:type="gramStart"/>
+      <w:r>
+        <w:rPr>
+          <w:rFonts w:ascii="Times New Roman" w:hAnsi="Times New Roman" w:cs="Times New Roman"/>
+        </w:rPr>
+        <w:t>execute</w:t>
+      </w:r>
+      <w:proofErr w:type="gramEnd"/>
+      <w:r>
+        <w:rPr>
+          <w:rFonts w:ascii="Times New Roman" w:hAnsi="Times New Roman" w:cs="Times New Roman"/>
+        </w:rPr>
+        <w:t xml:space="preserve"> and iteratively </w:t>
+      </w:r>
+      <w:proofErr w:type="gramStart"/>
+      <w:r>
+        <w:rPr>
+          <w:rFonts w:ascii="Times New Roman" w:hAnsi="Times New Roman" w:cs="Times New Roman"/>
+        </w:rPr>
+        <w:t>improve</w:t>
+      </w:r>
+      <w:proofErr w:type="gramEnd"/>
+      <w:r>
+        <w:rPr>
+          <w:rFonts w:ascii="Times New Roman" w:hAnsi="Times New Roman" w:cs="Times New Roman"/>
+        </w:rPr>
+        <w:t xml:space="preserve"> geospatial models and simulation</w:t>
       </w:r>
       <w:r>
         <w:rPr>
@@ -625,13 +707,7 @@
         <w:rPr>
           <w:rFonts w:ascii="Times New Roman" w:hAnsi="Times New Roman" w:cs="Times New Roman"/>
         </w:rPr>
-        <w:t>Reflect on the limitations of AI in geospatial practice, including issues of transparency, reliability, data quality, and over-reliance on automated solutions.</w:t>
-      </w:r>
-      <w:r>
-        <w:rPr>
-          <w:rFonts w:ascii="Times New Roman" w:hAnsi="Times New Roman" w:cs="Times New Roman"/>
-        </w:rPr>
-        <w:t xml:space="preserve"> </w:t>
+        <w:t xml:space="preserve">Reflect on the limitations of AI in geospatial practice, including issues of transparency, reliability, data quality, and over-reliance on automated solutions. </w:t>
       </w:r>
     </w:p>
     <w:p>
@@ -664,7 +740,21 @@
         <w:rPr>
           <w:rFonts w:ascii="Times New Roman" w:hAnsi="Times New Roman" w:cs="Times New Roman"/>
         </w:rPr>
-        <w:t xml:space="preserve"> best suit their topic. Seek advice if you are unsure which path to take. Indeed, plenty of time is allocated in the course to help refine </w:t>
+        <w:t xml:space="preserve"> best suit their topic. Seek advice if you are unsure which path to take. Indeed, plenty of time is allocated </w:t>
+      </w:r>
+      <w:proofErr w:type="gramStart"/>
+      <w:r>
+        <w:rPr>
+          <w:rFonts w:ascii="Times New Roman" w:hAnsi="Times New Roman" w:cs="Times New Roman"/>
+        </w:rPr>
+        <w:t>in</w:t>
+      </w:r>
+      <w:proofErr w:type="gramEnd"/>
+      <w:r>
+        <w:rPr>
+          <w:rFonts w:ascii="Times New Roman" w:hAnsi="Times New Roman" w:cs="Times New Roman"/>
+        </w:rPr>
+        <w:t xml:space="preserve"> the course to help refine </w:t>
       </w:r>
       <w:r>
         <w:rPr>
@@ -720,7 +810,21 @@
         <w:rPr>
           <w:rFonts w:ascii="Times New Roman" w:hAnsi="Times New Roman" w:cs="Times New Roman"/>
         </w:rPr>
-        <w:t xml:space="preserve"> constitute a potential job market paper, consequently demonstrating </w:t>
+        <w:t xml:space="preserve"> constitute a potential job market paper, consequently </w:t>
+      </w:r>
+      <w:proofErr w:type="gramStart"/>
+      <w:r>
+        <w:rPr>
+          <w:rFonts w:ascii="Times New Roman" w:hAnsi="Times New Roman" w:cs="Times New Roman"/>
+        </w:rPr>
+        <w:t>demonstrating</w:t>
+      </w:r>
+      <w:proofErr w:type="gramEnd"/>
+      <w:r>
+        <w:rPr>
+          <w:rFonts w:ascii="Times New Roman" w:hAnsi="Times New Roman" w:cs="Times New Roman"/>
+        </w:rPr>
+        <w:t xml:space="preserve"> </w:t>
       </w:r>
       <w:r>
         <w:rPr>
@@ -855,8 +959,16 @@
         <w:rPr>
           <w:rFonts w:ascii="Times New Roman" w:hAnsi="Times New Roman" w:cs="Times New Roman"/>
         </w:rPr>
-        <w:t>Agentic GeoAI</w:t>
-      </w:r>
+        <w:t xml:space="preserve">Agentic </w:t>
+      </w:r>
+      <w:proofErr w:type="spellStart"/>
+      <w:r>
+        <w:rPr>
+          <w:rFonts w:ascii="Times New Roman" w:hAnsi="Times New Roman" w:cs="Times New Roman"/>
+        </w:rPr>
+        <w:t>GeoAI</w:t>
+      </w:r>
+      <w:proofErr w:type="spellEnd"/>
       <w:r>
         <w:rPr>
           <w:rFonts w:ascii="Times New Roman" w:hAnsi="Times New Roman" w:cs="Times New Roman"/>
@@ -903,7 +1015,7 @@
         <w:rPr>
           <w:rFonts w:ascii="Times New Roman" w:hAnsi="Times New Roman" w:cs="Times New Roman"/>
         </w:rPr>
-        <w:t>6</w:t>
+        <w:t>4</w:t>
       </w:r>
       <w:r>
         <w:rPr>
@@ -1159,6 +1271,7 @@
         </w:rPr>
         <w:t xml:space="preserve">Microsoft </w:t>
       </w:r>
+      <w:proofErr w:type="gramStart"/>
       <w:r>
         <w:rPr>
           <w:rFonts w:ascii="Times New Roman" w:hAnsi="Times New Roman" w:cs="Times New Roman"/>
@@ -1169,7 +1282,14 @@
         <w:rPr>
           <w:rFonts w:ascii="Times New Roman" w:hAnsi="Times New Roman" w:cs="Times New Roman"/>
         </w:rPr>
-        <w:t xml:space="preserve">ord (.docx) and </w:t>
+        <w:t>ord (.</w:t>
+      </w:r>
+      <w:proofErr w:type="gramEnd"/>
+      <w:r>
+        <w:rPr>
+          <w:rFonts w:ascii="Times New Roman" w:hAnsi="Times New Roman" w:cs="Times New Roman"/>
+        </w:rPr>
+        <w:t xml:space="preserve">docx) and </w:t>
       </w:r>
       <w:r>
         <w:rPr>
@@ -1183,6 +1303,7 @@
         </w:rPr>
         <w:t xml:space="preserve"> document</w:t>
       </w:r>
+      <w:proofErr w:type="gramStart"/>
       <w:r>
         <w:rPr>
           <w:rFonts w:ascii="Times New Roman" w:hAnsi="Times New Roman" w:cs="Times New Roman"/>
@@ -1193,7 +1314,14 @@
         <w:rPr>
           <w:rFonts w:ascii="Times New Roman" w:hAnsi="Times New Roman" w:cs="Times New Roman"/>
         </w:rPr>
-        <w:t xml:space="preserve">, and </w:t>
+        <w:t>, and</w:t>
+      </w:r>
+      <w:proofErr w:type="gramEnd"/>
+      <w:r>
+        <w:rPr>
+          <w:rFonts w:ascii="Times New Roman" w:hAnsi="Times New Roman" w:cs="Times New Roman"/>
+        </w:rPr>
+        <w:t xml:space="preserve"> </w:t>
       </w:r>
       <w:r>
         <w:rPr>
@@ -1292,7 +1420,21 @@
         <w:rPr>
           <w:rFonts w:ascii="Times New Roman" w:hAnsi="Times New Roman" w:cs="Times New Roman"/>
         </w:rPr>
-        <w:t xml:space="preserve">paper, including the motivation, research question, </w:t>
+        <w:t xml:space="preserve">paper, including </w:t>
+      </w:r>
+      <w:proofErr w:type="gramStart"/>
+      <w:r>
+        <w:rPr>
+          <w:rFonts w:ascii="Times New Roman" w:hAnsi="Times New Roman" w:cs="Times New Roman"/>
+        </w:rPr>
+        <w:t>the motivation</w:t>
+      </w:r>
+      <w:proofErr w:type="gramEnd"/>
+      <w:r>
+        <w:rPr>
+          <w:rFonts w:ascii="Times New Roman" w:hAnsi="Times New Roman" w:cs="Times New Roman"/>
+        </w:rPr>
+        <w:t xml:space="preserve">, research question, </w:t>
       </w:r>
       <w:r>
         <w:rPr>
@@ -1466,12 +1608,14 @@
         </w:rPr>
         <w:t xml:space="preserve">Agentic </w:t>
       </w:r>
+      <w:proofErr w:type="spellStart"/>
       <w:r>
         <w:rPr>
           <w:rFonts w:ascii="Times New Roman" w:hAnsi="Times New Roman" w:cs="Times New Roman"/>
         </w:rPr>
         <w:t>GeoAI</w:t>
       </w:r>
+      <w:proofErr w:type="spellEnd"/>
       <w:r>
         <w:rPr>
           <w:rFonts w:ascii="Times New Roman" w:hAnsi="Times New Roman" w:cs="Times New Roman"/>
@@ -1787,7 +1931,21 @@
         <w:rPr>
           <w:rFonts w:ascii="Times New Roman" w:hAnsi="Times New Roman" w:cs="Times New Roman"/>
         </w:rPr>
-        <w:t xml:space="preserve">Agentic GeoAI </w:t>
+        <w:t xml:space="preserve">Agentic </w:t>
+      </w:r>
+      <w:proofErr w:type="spellStart"/>
+      <w:r>
+        <w:rPr>
+          <w:rFonts w:ascii="Times New Roman" w:hAnsi="Times New Roman" w:cs="Times New Roman"/>
+        </w:rPr>
+        <w:t>GeoAI</w:t>
+      </w:r>
+      <w:proofErr w:type="spellEnd"/>
+      <w:r>
+        <w:rPr>
+          <w:rFonts w:ascii="Times New Roman" w:hAnsi="Times New Roman" w:cs="Times New Roman"/>
+        </w:rPr>
+        <w:t xml:space="preserve"> </w:t>
       </w:r>
       <w:r>
         <w:rPr>
@@ -1831,7 +1989,21 @@
         <w:rPr>
           <w:rFonts w:ascii="Times New Roman" w:hAnsi="Times New Roman" w:cs="Times New Roman"/>
         </w:rPr>
-        <w:t xml:space="preserve">A total of 100 points is available, and this will be scaled as a percentage to the 250 point allocated in the course syllabus. </w:t>
+        <w:t xml:space="preserve">A total of 100 points is available, and this will be scaled as a percentage to the </w:t>
+      </w:r>
+      <w:proofErr w:type="gramStart"/>
+      <w:r>
+        <w:rPr>
+          <w:rFonts w:ascii="Times New Roman" w:hAnsi="Times New Roman" w:cs="Times New Roman"/>
+        </w:rPr>
+        <w:t>250 point</w:t>
+      </w:r>
+      <w:proofErr w:type="gramEnd"/>
+      <w:r>
+        <w:rPr>
+          <w:rFonts w:ascii="Times New Roman" w:hAnsi="Times New Roman" w:cs="Times New Roman"/>
+        </w:rPr>
+        <w:t xml:space="preserve"> allocated in the course syllabus. </w:t>
       </w:r>
     </w:p>
     <w:p>
@@ -1883,13 +2055,35 @@
         <w:rPr>
           <w:rFonts w:ascii="Times New Roman" w:hAnsi="Times New Roman" w:cs="Times New Roman"/>
         </w:rPr>
-        <w:t>Agentic GeoAI</w:t>
-      </w:r>
-      <w:r>
-        <w:rPr>
-          <w:rFonts w:ascii="Times New Roman" w:hAnsi="Times New Roman" w:cs="Times New Roman"/>
-        </w:rPr>
-        <w:t xml:space="preserve"> class and you will be graded on the Python code you write</w:t>
+        <w:t xml:space="preserve">Agentic </w:t>
+      </w:r>
+      <w:proofErr w:type="spellStart"/>
+      <w:r>
+        <w:rPr>
+          <w:rFonts w:ascii="Times New Roman" w:hAnsi="Times New Roman" w:cs="Times New Roman"/>
+        </w:rPr>
+        <w:t>GeoAI</w:t>
+      </w:r>
+      <w:proofErr w:type="spellEnd"/>
+      <w:r>
+        <w:rPr>
+          <w:rFonts w:ascii="Times New Roman" w:hAnsi="Times New Roman" w:cs="Times New Roman"/>
+        </w:rPr>
+        <w:t xml:space="preserve"> </w:t>
+      </w:r>
+      <w:proofErr w:type="gramStart"/>
+      <w:r>
+        <w:rPr>
+          <w:rFonts w:ascii="Times New Roman" w:hAnsi="Times New Roman" w:cs="Times New Roman"/>
+        </w:rPr>
+        <w:t>class</w:t>
+      </w:r>
+      <w:proofErr w:type="gramEnd"/>
+      <w:r>
+        <w:rPr>
+          <w:rFonts w:ascii="Times New Roman" w:hAnsi="Times New Roman" w:cs="Times New Roman"/>
+        </w:rPr>
+        <w:t xml:space="preserve"> and you will be graded on the Python code you write</w:t>
       </w:r>
       <w:r>
         <w:rPr>
@@ -2213,6 +2407,7 @@
       </w:rPr>
       <w:t xml:space="preserve">Agentic </w:t>
     </w:r>
+    <w:proofErr w:type="spellStart"/>
     <w:r>
       <w:rPr>
         <w:rFonts w:ascii="Times New Roman" w:hAnsi="Times New Roman" w:cs="Times New Roman"/>
@@ -2223,6 +2418,7 @@
       </w:rPr>
       <w:t>GeoAI</w:t>
     </w:r>
+    <w:proofErr w:type="spellEnd"/>
     <w:r>
       <w:rPr>
         <w:rFonts w:ascii="Times New Roman" w:hAnsi="Times New Roman" w:cs="Times New Roman"/>
@@ -3335,6 +3531,7 @@
   <w:style w:type="character" w:default="1" w:styleId="DefaultParagraphFont">
     <w:name w:val="Default Paragraph Font"/>
     <w:uiPriority w:val="1"/>
+    <w:semiHidden/>
     <w:unhideWhenUsed/>
   </w:style>
   <w:style w:type="table" w:default="1" w:styleId="TableNormal">

</xml_diff>